<commit_message>
feat: add email OTP authentication, admin decision workflows, and journal publication templates
</commit_message>
<xml_diff>
--- a/public/templates/aiisc/AIISC-chapter-template.docx
+++ b/public/templates/aiisc/AIISC-chapter-template.docx
@@ -926,6 +926,125 @@
 <w:ftr xmlns:wpc="http://schemas.microsoft.com/office/word/2010/wordprocessingCanvas" xmlns:mc="http://schemas.openxmlformats.org/markup-compatibility/2006" xmlns:o="urn:schemas-microsoft-com:office:office" xmlns:r="http://schemas.openxmlformats.org/officeDocument/2006/relationships" xmlns:m="http://schemas.openxmlformats.org/officeDocument/2006/math" xmlns:v="urn:schemas-microsoft-com:vml" xmlns:wp14="http://schemas.microsoft.com/office/word/2010/wordprocessingDrawing" xmlns:wp="http://schemas.openxmlformats.org/drawingml/2006/wordprocessingDrawing" xmlns:w10="urn:schemas-microsoft-com:office:word" xmlns:w="http://schemas.openxmlformats.org/wordprocessingml/2006/main" xmlns:w14="http://schemas.microsoft.com/office/word/2010/wordml" xmlns:w15="http://schemas.microsoft.com/office/word/2012/wordml" xmlns:wpg="http://schemas.microsoft.com/office/word/2010/wordprocessingGroup" xmlns:wpi="http://schemas.microsoft.com/office/word/2010/wordprocessingInk" xmlns:wne="http://schemas.microsoft.com/office/word/2006/wordml" xmlns:wps="http://schemas.microsoft.com/office/word/2010/wordprocessingShape">
   <w:p>
     <w:pPr>
+      <w:pBdr>
+        <w:top w:val="single" w:color="B9C1C9" w:sz="4"/>
+      </w:pBdr>
+      <w:spacing w:after="0" w:before="60"/>
+    </w:pPr>
+    <w:r>
+      <w:rPr>
+        <w:b/>
+        <w:bCs/>
+        <w:color w:val="101B27"/>
+        <w:sz w:val="16"/>
+        <w:szCs w:val="16"/>
+      </w:rPr>
+      <w:t xml:space="preserve">Received: </w:t>
+    </w:r>
+    <w:r>
+      <w:rPr>
+        <w:color w:val="505C68"/>
+        <w:sz w:val="16"/>
+        <w:szCs w:val="16"/>
+      </w:rPr>
+      <w:t xml:space="preserve">DD Month YYYY</w:t>
+    </w:r>
+    <w:r>
+      <w:rPr>
+        <w:color w:val="B9C1C9"/>
+        <w:sz w:val="16"/>
+        <w:szCs w:val="16"/>
+      </w:rPr>
+      <w:t xml:space="preserve">  |  </w:t>
+    </w:r>
+    <w:r>
+      <w:rPr>
+        <w:b/>
+        <w:bCs/>
+        <w:color w:val="101B27"/>
+        <w:sz w:val="16"/>
+        <w:szCs w:val="16"/>
+      </w:rPr>
+      <w:t xml:space="preserve">Revised: </w:t>
+    </w:r>
+    <w:r>
+      <w:rPr>
+        <w:color w:val="505C68"/>
+        <w:sz w:val="16"/>
+        <w:szCs w:val="16"/>
+      </w:rPr>
+      <w:t xml:space="preserve">DD Month YYYY</w:t>
+    </w:r>
+    <w:r>
+      <w:rPr>
+        <w:color w:val="B9C1C9"/>
+        <w:sz w:val="16"/>
+        <w:szCs w:val="16"/>
+      </w:rPr>
+      <w:t xml:space="preserve">  |  </w:t>
+    </w:r>
+    <w:r>
+      <w:rPr>
+        <w:b/>
+        <w:bCs/>
+        <w:color w:val="101B27"/>
+        <w:sz w:val="16"/>
+        <w:szCs w:val="16"/>
+      </w:rPr>
+      <w:t xml:space="preserve">Accepted: </w:t>
+    </w:r>
+    <w:r>
+      <w:rPr>
+        <w:color w:val="505C68"/>
+        <w:sz w:val="16"/>
+        <w:szCs w:val="16"/>
+      </w:rPr>
+      <w:t xml:space="preserve">DD Month YYYY</w:t>
+    </w:r>
+    <w:r>
+      <w:rPr>
+        <w:color w:val="B9C1C9"/>
+        <w:sz w:val="16"/>
+        <w:szCs w:val="16"/>
+      </w:rPr>
+      <w:t xml:space="preserve">  |  </w:t>
+    </w:r>
+    <w:r>
+      <w:rPr>
+        <w:b/>
+        <w:bCs/>
+        <w:color w:val="101B27"/>
+        <w:sz w:val="16"/>
+        <w:szCs w:val="16"/>
+      </w:rPr>
+      <w:t xml:space="preserve">Published: </w:t>
+    </w:r>
+    <w:r>
+      <w:rPr>
+        <w:color w:val="505C68"/>
+        <w:sz w:val="16"/>
+        <w:szCs w:val="16"/>
+      </w:rPr>
+      <w:t xml:space="preserve">DD Month YYYY</w:t>
+    </w:r>
+  </w:p>
+  <w:p>
+    <w:pPr>
+      <w:spacing w:after="80"/>
+    </w:pPr>
+    <w:r>
+      <w:rPr>
+        <w:i/>
+        <w:iCs/>
+        <w:color w:val="505C68"/>
+        <w:sz w:val="15"/>
+        <w:szCs w:val="15"/>
+      </w:rPr>
+      <w:t xml:space="preserve">Article history: completed by the editorial office. Leave as is.</w:t>
+    </w:r>
+  </w:p>
+  <w:p>
+    <w:pPr>
       <w:tabs>
         <w:tab w:val="right" w:pos="9070"/>
       </w:tabs>
@@ -1107,19 +1226,20 @@
       </w:tblBorders>
     </w:tblPr>
     <w:tblGrid>
-      <w:gridCol w:w="900"/>
-      <w:gridCol w:w="8170"/>
+      <w:gridCol w:w="2700"/>
+      <w:gridCol w:w="6370"/>
     </w:tblGrid>
     <w:tr>
       <w:tc>
         <w:tcPr>
-          <w:tcW w:type="dxa" w:w="900"/>
+          <w:tcW w:type="dxa" w:w="2700"/>
           <w:tcBorders>
             <w:top w:val="none" w:color="FFFFFF" w:sz="0"/>
             <w:left w:val="none" w:color="FFFFFF" w:sz="0"/>
             <w:bottom w:val="none" w:color="FFFFFF" w:sz="0"/>
             <w:right w:val="none" w:color="FFFFFF" w:sz="0"/>
           </w:tcBorders>
+          <w:vAlign w:val="center"/>
         </w:tcPr>
         <w:p>
           <w:pPr>
@@ -1128,9 +1248,9 @@
           <w:r>
             <w:drawing>
               <wp:inline distT="0" distB="0" distL="0" distR="0">
-                <wp:extent cx="381000" cy="400050"/>
+                <wp:extent cx="1600200" cy="333375"/>
                 <wp:effectExtent t="0" r="0" b="0" l="0"/>
-                <wp:docPr id="5" name=""/>
+                <wp:docPr id="11" name=""/>
                 <wp:cNvGraphicFramePr>
                   <a:graphicFrameLocks xmlns:a="http://schemas.openxmlformats.org/drawingml/2006/main" noChangeAspect="1"/>
                 </wp:cNvGraphicFramePr>
@@ -1153,7 +1273,7 @@
                       <pic:spPr bwMode="auto">
                         <a:xfrm>
                           <a:off x="0" y="0"/>
-                          <a:ext cx="381000" cy="400050"/>
+                          <a:ext cx="1600200" cy="333375"/>
                         </a:xfrm>
                         <a:prstGeom prst="rect">
                           <a:avLst/>
@@ -1169,17 +1289,19 @@
       </w:tc>
       <w:tc>
         <w:tcPr>
-          <w:tcW w:type="dxa" w:w="8170"/>
+          <w:tcW w:type="dxa" w:w="6370"/>
           <w:tcBorders>
             <w:top w:val="none" w:color="FFFFFF" w:sz="0"/>
             <w:left w:val="none" w:color="FFFFFF" w:sz="0"/>
             <w:bottom w:val="none" w:color="FFFFFF" w:sz="0"/>
             <w:right w:val="none" w:color="FFFFFF" w:sz="0"/>
           </w:tcBorders>
+          <w:vAlign w:val="center"/>
         </w:tcPr>
         <w:p>
           <w:pPr>
-            <w:spacing w:after="0" w:before="40"/>
+            <w:spacing w:after="0"/>
+            <w:jc w:val="right"/>
           </w:pPr>
           <w:r>
             <w:rPr>
@@ -1194,6 +1316,7 @@
         <w:p>
           <w:pPr>
             <w:spacing w:after="0"/>
+            <w:jc w:val="right"/>
           </w:pPr>
           <w:r>
             <w:rPr>
@@ -1201,7 +1324,7 @@
               <w:sz w:val="17"/>
               <w:szCs w:val="17"/>
             </w:rPr>
-            <w:t xml:space="preserve">NextGenIQ Press · [Title of the Volume]</w:t>
+            <w:t xml:space="preserve">[Title of the Volume]</w:t>
           </w:r>
         </w:p>
       </w:tc>

</xml_diff>